<commit_message>
Update Shop by Grade story: code-defined background+icon, authorable top image
Clarified authoring model: only the top image (plus label/link) is authorable;
background+icon combinations are code-defined and the author selects which
background style sits at any position. Updated description, design specs,
authoring details, and acceptance criteria accordingly.

Co-Authored-By: Claude Opus 4.6 (1M context) <noreply@anthropic.com>
</commit_message>
<xml_diff>
--- a/docs/SDD/Stories/Home-Page/EC-Shop-by-Grade-Level-Story.docx
+++ b/docs/SDD/Stories/Home-Page/EC-Shop-by-Grade-Level-Story.docx
@@ -160,7 +160,25 @@
         <w:t>Shop by Grade Level</w:t>
       </w:r>
       <w:r>
-        <w:t xml:space="preserve"> block: a heading plus a single row of grade tiles. Each tile is an image + a button/label that links to the products for that Girl Scout level. The block is responsive across Desktop / Tablet / Mobile (per the Figma component set).</w:t>
+        <w:t xml:space="preserve"> block: a heading plus a single row of grade tiles. Each tile is a </w:t>
+      </w:r>
+      <w:r>
+        <w:rPr>
+          <w:b/>
+        </w:rPr>
+        <w:t>top image</w:t>
+      </w:r>
+      <w:r>
+        <w:t xml:space="preserve"> (the grade photo) + a decorative </w:t>
+      </w:r>
+      <w:r>
+        <w:rPr>
+          <w:b/>
+        </w:rPr>
+        <w:t>background + icon</w:t>
+      </w:r>
+      <w:r>
+        <w:t xml:space="preserve"> treatment + a button/label that links to the products for that Girl Scout level. The block is responsive across Desktop / Tablet / Mobile (per the Figma component set); on smaller viewports it becomes a swipeable carousel with dots.</w:t>
       </w:r>
     </w:p>
     <w:p>
@@ -175,6 +193,79 @@
       </w:r>
       <w:r>
         <w:t xml:space="preserve"> (7 tiles).</w:t>
+      </w:r>
+    </w:p>
+    <w:p>
+      <w:pPr>
+        <w:pStyle w:val="Heading3"/>
+      </w:pPr>
+      <w:r>
+        <w:t>Authoring Model (IMPORTANT)</w:t>
+      </w:r>
+    </w:p>
+    <w:p>
+      <w:pPr>
+        <w:pStyle w:val="ListBullet"/>
+      </w:pPr>
+      <w:r>
+        <w:rPr>
+          <w:b/>
+        </w:rPr>
+        <w:t>Only the top image is authorable</w:t>
+      </w:r>
+      <w:r>
+        <w:t xml:space="preserve"> per tile (plus the label and link).</w:t>
+      </w:r>
+    </w:p>
+    <w:p>
+      <w:pPr>
+        <w:pStyle w:val="ListBullet"/>
+      </w:pPr>
+      <w:r>
+        <w:t xml:space="preserve">The </w:t>
+      </w:r>
+      <w:r>
+        <w:rPr>
+          <w:b/>
+        </w:rPr>
+        <w:t>decorative background + icon combinations are code-defined</w:t>
+      </w:r>
+      <w:r>
+        <w:t xml:space="preserve"> — the pairing of a given background shape with its icon (e.g., blue cloud + flower, beige trapezoid + butterfly, lavender circle + star, pink diamond + mushroom, peach square + rocket, green + butterfly, blue blob + bird) is fixed in code and NOT individually editable by the author.</w:t>
+      </w:r>
+    </w:p>
+    <w:p>
+      <w:pPr>
+        <w:pStyle w:val="ListBullet"/>
+      </w:pPr>
+      <w:r>
+        <w:t xml:space="preserve">The author can </w:t>
+      </w:r>
+      <w:r>
+        <w:rPr>
+          <w:b/>
+        </w:rPr>
+        <w:t>choose which background (and its bundled icon) appears at any position</w:t>
+      </w:r>
+      <w:r>
+        <w:t xml:space="preserve"> in the row — i.e., assign a code-provided background option to a tile/position. The author does not design or recombine background+icon; they only pick from the code-provided set and place it.</w:t>
+      </w:r>
+    </w:p>
+    <w:p>
+      <w:pPr>
+        <w:pStyle w:val="ListBullet"/>
+      </w:pPr>
+      <w:r>
+        <w:t xml:space="preserve">Net effect: authors control the </w:t>
+      </w:r>
+      <w:r>
+        <w:rPr>
+          <w:b/>
+        </w:rPr>
+        <w:t>photo, label, link, and which background-style sits where</w:t>
+      </w:r>
+      <w:r>
+        <w:t>; the visual styling of each background+icon stays consistent and on-brand because it lives in code.</w:t>
       </w:r>
     </w:p>
     <w:p>
@@ -219,7 +310,7 @@
         <w:t>146×192</w:t>
       </w:r>
       <w:r>
-        <w:t xml:space="preserve"> = image (146×146, </w:t>
+        <w:t xml:space="preserve"> = top image (146×146, </w:t>
       </w:r>
       <w:r>
         <w:rPr>
@@ -228,7 +319,16 @@
         <w:t>aspect 1:1</w:t>
       </w:r>
       <w:r>
-        <w:t>) + a button (</w:t>
+        <w:t xml:space="preserve">) layered over a code-defined </w:t>
+      </w:r>
+      <w:r>
+        <w:rPr>
+          <w:b/>
+        </w:rPr>
+        <w:t>decorative background + icon</w:t>
+      </w:r>
+      <w:r>
+        <w:t>, plus a button (</w:t>
       </w:r>
       <w:r>
         <w:rPr>
@@ -240,6 +340,20 @@
       </w:r>
       <w:r>
         <w:t>, 146×36) with the grade label.</w:t>
+      </w:r>
+    </w:p>
+    <w:p>
+      <w:pPr>
+        <w:pStyle w:val="ListBullet"/>
+      </w:pPr>
+      <w:r>
+        <w:rPr>
+          <w:b/>
+        </w:rPr>
+        <w:t>Background + icon set (code-defined)</w:t>
+      </w:r>
+      <w:r>
+        <w:t xml:space="preserve"> — observed pairings: blue cloud + flower, beige/tan trapezoid + butterfly, lavender circle + star, white/pink diamond + mushroom, peach square + rocket, green shape + butterfly, blue blob + bird. Each background is a distinct shape with a fixed accent icon; the full set is provided by code.</w:t>
       </w:r>
     </w:p>
     <w:p>
@@ -266,7 +380,7 @@
         <w:t>#005640</w:t>
       </w:r>
       <w:r>
-        <w:t xml:space="preserve"> for button/active state.</w:t>
+        <w:t xml:space="preserve"> for button/active/link state.</w:t>
       </w:r>
     </w:p>
     <w:p>
@@ -296,7 +410,7 @@
         <w:pStyle w:val="ListBullet"/>
       </w:pPr>
       <w:r>
-        <w:t>Tablet 768×418 — fewer per row / wrap or scroll.</w:t>
+        <w:t>Tablet 768×418 — carousel showing ~4 tiles with dots indicator (labels shown as green text links).</w:t>
       </w:r>
     </w:p>
     <w:p>
@@ -304,7 +418,7 @@
         <w:pStyle w:val="ListBullet"/>
       </w:pPr>
       <w:r>
-        <w:t>Mobile 360×386 — horizontal scroll or 2–3 per row (confirm exact behavior).</w:t>
+        <w:t>Mobile 360×386 — carousel showing ~2 tiles with dots indicator; swipe to advance.</w:t>
       </w:r>
     </w:p>
     <w:p>
@@ -407,7 +521,7 @@
         <w:pStyle w:val="ListBullet"/>
       </w:pPr>
       <w:r>
-        <w:t>Author-configurable:</w:t>
+        <w:t>Author-configurable per tile:</w:t>
       </w:r>
     </w:p>
     <w:p>
@@ -418,10 +532,10 @@
         <w:rPr>
           <w:b/>
         </w:rPr>
-        <w:t>Heading</w:t>
+        <w:t>Top image</w:t>
       </w:r>
       <w:r>
-        <w:t xml:space="preserve"> text.</w:t>
+        <w:t xml:space="preserve"> (required) — the grade photo.</w:t>
       </w:r>
     </w:p>
     <w:p>
@@ -432,10 +546,83 @@
         <w:rPr>
           <w:b/>
         </w:rPr>
-        <w:t>Grade tiles</w:t>
+        <w:t>Grade label</w:t>
       </w:r>
       <w:r>
-        <w:t>: each tile = image (required), grade label (button text), and link (target PLP/category URL).</w:t>
+        <w:t xml:space="preserve"> (button/link text).</w:t>
+      </w:r>
+    </w:p>
+    <w:p>
+      <w:pPr>
+        <w:pStyle w:val="ListBullet"/>
+      </w:pPr>
+      <w:r>
+        <w:rPr>
+          <w:b/>
+        </w:rPr>
+        <w:t>Link</w:t>
+      </w:r>
+      <w:r>
+        <w:t xml:space="preserve"> (target PLP/category URL).</w:t>
+      </w:r>
+    </w:p>
+    <w:p>
+      <w:pPr>
+        <w:pStyle w:val="ListBullet"/>
+      </w:pPr>
+      <w:r>
+        <w:rPr>
+          <w:b/>
+        </w:rPr>
+        <w:t>Background option</w:t>
+      </w:r>
+      <w:r>
+        <w:t xml:space="preserve"> — author selects one of the </w:t>
+      </w:r>
+      <w:r>
+        <w:rPr>
+          <w:b/>
+        </w:rPr>
+        <w:t>code-provided background+icon styles</w:t>
+      </w:r>
+      <w:r>
+        <w:t xml:space="preserve"> to apply at this position (e.g., a named option like </w:t>
+      </w:r>
+      <w:r>
+        <w:rPr>
+          <w:rFonts w:ascii="Consolas" w:hAnsi="Consolas"/>
+          <w:color w:val="8B0000"/>
+          <w:sz w:val="18"/>
+        </w:rPr>
+        <w:t>style-1</w:t>
+      </w:r>
+      <w:r>
+        <w:t>…</w:t>
+      </w:r>
+      <w:r>
+        <w:rPr>
+          <w:rFonts w:ascii="Consolas" w:hAnsi="Consolas"/>
+          <w:color w:val="8B0000"/>
+          <w:sz w:val="18"/>
+        </w:rPr>
+        <w:t>style-7</w:t>
+      </w:r>
+      <w:r>
+        <w:t>). The author chooses WHICH background goes WHERE; they cannot edit the background shape or its icon.</w:t>
+      </w:r>
+    </w:p>
+    <w:p>
+      <w:pPr>
+        <w:pStyle w:val="ListBullet"/>
+      </w:pPr>
+      <w:r>
+        <w:rPr>
+          <w:b/>
+        </w:rPr>
+        <w:t>NOT authorable</w:t>
+      </w:r>
+      <w:r>
+        <w:t>: the background shapes, the icons, and the background↔icon pairing — these are defined in code. The author only picks from the provided set and places it at a position.</w:t>
       </w:r>
     </w:p>
     <w:p>
@@ -489,7 +676,7 @@
         <w:pStyle w:val="ListBullet"/>
       </w:pPr>
       <w:r>
-        <w:t>Author can add/edit/remove/reorder grade tiles (image, label, link).</w:t>
+        <w:t>Author can add/edit/remove/reorder grade tiles.</w:t>
       </w:r>
     </w:p>
     <w:p>
@@ -497,7 +684,92 @@
         <w:pStyle w:val="ListBullet"/>
       </w:pPr>
       <w:r>
-        <w:t>Tiles render in a responsive row (Desktop 7-up; tablet/mobile reflow/scroll).</w:t>
+        <w:t xml:space="preserve">Per tile, author can set the </w:t>
+      </w:r>
+      <w:r>
+        <w:rPr>
+          <w:b/>
+        </w:rPr>
+        <w:t>top image</w:t>
+      </w:r>
+      <w:r>
+        <w:t xml:space="preserve">, </w:t>
+      </w:r>
+      <w:r>
+        <w:rPr>
+          <w:b/>
+        </w:rPr>
+        <w:t>label</w:t>
+      </w:r>
+      <w:r>
+        <w:t xml:space="preserve">, and </w:t>
+      </w:r>
+      <w:r>
+        <w:rPr>
+          <w:b/>
+        </w:rPr>
+        <w:t>link</w:t>
+      </w:r>
+      <w:r>
+        <w:t>.</w:t>
+      </w:r>
+    </w:p>
+    <w:p>
+      <w:pPr>
+        <w:pStyle w:val="ListBullet"/>
+      </w:pPr>
+      <w:r>
+        <w:t xml:space="preserve">Per tile/position, author can </w:t>
+      </w:r>
+      <w:r>
+        <w:rPr>
+          <w:b/>
+        </w:rPr>
+        <w:t>select a background option from the code-provided set</w:t>
+      </w:r>
+      <w:r>
+        <w:t>; the chosen background+icon renders at that position.</w:t>
+      </w:r>
+    </w:p>
+    <w:p>
+      <w:pPr>
+        <w:pStyle w:val="ListBullet"/>
+      </w:pPr>
+      <w:r>
+        <w:t>Author can place any available background option at any position (background choice is independent of which grade is in the tile).</w:t>
+      </w:r>
+    </w:p>
+    <w:p>
+      <w:pPr>
+        <w:pStyle w:val="ListBullet"/>
+      </w:pPr>
+      <w:r>
+        <w:t xml:space="preserve">Author </w:t>
+      </w:r>
+      <w:r>
+        <w:rPr>
+          <w:b/>
+        </w:rPr>
+        <w:t>cannot</w:t>
+      </w:r>
+      <w:r>
+        <w:t xml:space="preserve"> edit the background shapes, icons, or the background↔icon pairing (these are code-controlled).</w:t>
+      </w:r>
+    </w:p>
+    <w:p>
+      <w:pPr>
+        <w:pStyle w:val="ListBullet"/>
+      </w:pPr>
+      <w:r>
+        <w:t>If no background option is selected for a tile, a sensible default (or no decorative background) is applied without breaking layout.</w:t>
+      </w:r>
+    </w:p>
+    <w:p>
+      <w:pPr>
+        <w:pStyle w:val="ListBullet"/>
+      </w:pPr>
+      <w:r>
+        <w:t>Tiles render in a responsive row (Desktop 7-up; tablet/mobile carousel with dots).</w:t>
       </w:r>
     </w:p>
     <w:p>
@@ -513,7 +785,7 @@
         <w:pStyle w:val="ListBullet"/>
       </w:pPr>
       <w:r>
-        <w:t>Omitting a tile does not break the row layout.</w:t>
+        <w:t>Omitting a tile does not break the row/carousel layout.</w:t>
       </w:r>
     </w:p>
     <w:p>
@@ -521,7 +793,7 @@
         <w:pStyle w:val="ListBullet"/>
       </w:pPr>
       <w:r>
-        <w:t>Preview reflects the row before publish.</w:t>
+        <w:t>Preview reflects the row (including selected backgrounds) before publish.</w:t>
       </w:r>
     </w:p>
     <w:p>
@@ -545,7 +817,31 @@
         <w:pStyle w:val="ListBullet"/>
       </w:pPr>
       <w:r>
-        <w:t>Each tile shows its image and grade label; clicking the tile/button navigates to that grade's products.</w:t>
+        <w:t>Each tile shows its top image over the author-selected code-defined background+icon, plus the grade label.</w:t>
+      </w:r>
+    </w:p>
+    <w:p>
+      <w:pPr>
+        <w:pStyle w:val="ListBullet"/>
+      </w:pPr>
+      <w:r>
+        <w:t>The background+icon styling matches the design exactly (code-controlled), regardless of which grade photo is placed in the tile.</w:t>
+      </w:r>
+    </w:p>
+    <w:p>
+      <w:pPr>
+        <w:pStyle w:val="ListBullet"/>
+      </w:pPr>
+      <w:r>
+        <w:t>Clicking the tile/button/label navigates to that grade's products.</w:t>
+      </w:r>
+    </w:p>
+    <w:p>
+      <w:pPr>
+        <w:pStyle w:val="ListBullet"/>
+      </w:pPr>
+      <w:r>
+        <w:t>Decorative backgrounds/icons are treated as presentation only (do not interfere with the image or link).</w:t>
       </w:r>
     </w:p>
     <w:p>
@@ -561,7 +857,7 @@
         <w:pStyle w:val="ListBullet"/>
       </w:pPr>
       <w:r>
-        <w:t>Responsive: tiles reflow/scroll cleanly on tablet and mobile without overflow or distortion.</w:t>
+        <w:t>Responsive: Desktop shows 7 in a row; tablet/mobile show a swipeable carousel with a dots indicator; no overflow or distortion.</w:t>
       </w:r>
     </w:p>
     <w:p>
@@ -569,7 +865,7 @@
         <w:pStyle w:val="ListBullet"/>
       </w:pPr>
       <w:r>
-        <w:t>Keyboard: each tile is a focusable link with visible focus; logical tab order.</w:t>
+        <w:t>Keyboard: each tile is a focusable link with visible focus; logical tab order; carousel controls operable.</w:t>
       </w:r>
     </w:p>
     <w:p>
@@ -577,7 +873,7 @@
         <w:pStyle w:val="ListBullet"/>
       </w:pPr>
       <w:r>
-        <w:t>WCAG 2.1 AA: meaningful alt text (grade name), accessible link names, sufficient contrast, heading structure.</w:t>
+        <w:t>WCAG 2.1 AA: meaningful alt text (grade name), accessible link names, sufficient contrast, heading structure; decorative background/icon hidden from assistive tech.</w:t>
       </w:r>
     </w:p>
     <w:p>
@@ -794,7 +1090,62 @@
         <w:pStyle w:val="ListBullet"/>
       </w:pPr>
       <w:r>
-        <w:t>Confirm tablet/mobile layout (wrap vs. horizontal scroll; tiles-per-row).</w:t>
+        <w:t xml:space="preserve">Confirm the </w:t>
+      </w:r>
+      <w:r>
+        <w:rPr>
+          <w:b/>
+        </w:rPr>
+        <w:t>number of code-provided background+icon styles</w:t>
+      </w:r>
+      <w:r>
+        <w:t xml:space="preserve"> and their naming (so authors can reference them, e.g. </w:t>
+      </w:r>
+      <w:r>
+        <w:rPr>
+          <w:rFonts w:ascii="Consolas" w:hAnsi="Consolas"/>
+          <w:color w:val="8B0000"/>
+          <w:sz w:val="18"/>
+        </w:rPr>
+        <w:t>style-1</w:t>
+      </w:r>
+      <w:r>
+        <w:t>…</w:t>
+      </w:r>
+      <w:r>
+        <w:rPr>
+          <w:rFonts w:ascii="Consolas" w:hAnsi="Consolas"/>
+          <w:color w:val="8B0000"/>
+          <w:sz w:val="18"/>
+        </w:rPr>
+        <w:t>style-N</w:t>
+      </w:r>
+      <w:r>
+        <w:t>).</w:t>
+      </w:r>
+    </w:p>
+    <w:p>
+      <w:pPr>
+        <w:pStyle w:val="ListBullet"/>
+      </w:pPr>
+      <w:r>
+        <w:t>Confirm how the background option is exposed to authors in DA (e.g., a value/keyword cell per tile that maps to the code style).</w:t>
+      </w:r>
+    </w:p>
+    <w:p>
+      <w:pPr>
+        <w:pStyle w:val="ListBullet"/>
+      </w:pPr>
+      <w:r>
+        <w:t>Confirm default background behavior when none is selected.</w:t>
+      </w:r>
+    </w:p>
+    <w:p>
+      <w:pPr>
+        <w:pStyle w:val="ListBullet"/>
+      </w:pPr>
+      <w:r>
+        <w:t>Confirm tablet/mobile tiles-per-view (observed ~4 tablet / ~2 mobile, carousel with dots).</w:t>
       </w:r>
     </w:p>
     <w:p>

</xml_diff>